<commit_message>
Normalize line endings across repo
</commit_message>
<xml_diff>
--- a/Vouch_Review_Prep_Brief.docx
+++ b/Vouch_Review_Prep_Brief.docx
@@ -1831,6 +1831,429 @@
           </w:p>
         </w:tc>
       </w:tr>
+      <w:tr>
+        <w:tc>
+          <w:tcPr>
+            <w:tcW w:type="dxa" w:w="2200"/>
+            <w:tcMar>
+              <w:top w:type="dxa" w:w="100"/>
+              <w:left w:type="dxa" w:w="120"/>
+              <w:bottom w:type="dxa" w:w="100"/>
+              <w:right w:type="dxa" w:w="120"/>
+            </w:tcMar>
+          </w:tcPr>
+          <w:p>
+            <w:r>
+              <w:rPr>
+                <w:b w:val="false"/>
+                <w:bCs w:val="false"/>
+                <w:sz w:val="20"/>
+                <w:szCs w:val="20"/>
+              </w:rPr>
+              <w:t xml:space="preserve">Overdue-loan scheduler bypassed the row lock other loan mutations use</w:t>
+            </w:r>
+          </w:p>
+        </w:tc>
+        <w:tc>
+          <w:tcPr>
+            <w:tcW w:type="dxa" w:w="6900"/>
+            <w:tcMar>
+              <w:top w:type="dxa" w:w="100"/>
+              <w:left w:type="dxa" w:w="120"/>
+              <w:bottom w:type="dxa" w:w="100"/>
+              <w:right w:type="dxa" w:w="120"/>
+            </w:tcMar>
+          </w:tcPr>
+          <w:p>
+            <w:r>
+              <w:rPr>
+                <w:b w:val="false"/>
+                <w:bCs w:val="false"/>
+                <w:sz w:val="20"/>
+                <w:szCs w:val="20"/>
+              </w:rPr>
+              <w:t xml:space="preserve">The hourly job that checks for overdue loans read loans without the pessimistic lock used everywhere else, so a user action (repay/cancel/default) landing mid-job could theoretically be silently overwritten. Fixed by splitting the job into per-loan, separately-locked transactions instead of one long-lived batch transaction.</w:t>
+            </w:r>
+          </w:p>
+        </w:tc>
+        <w:tc>
+          <w:tcPr>
+            <w:tcW w:type="dxa" w:w="1500"/>
+            <w:tcMar>
+              <w:top w:type="dxa" w:w="100"/>
+              <w:left w:type="dxa" w:w="120"/>
+              <w:bottom w:type="dxa" w:w="100"/>
+              <w:right w:type="dxa" w:w="120"/>
+            </w:tcMar>
+          </w:tcPr>
+          <w:p>
+            <w:r>
+              <w:rPr>
+                <w:b/>
+                <w:bCs/>
+                <w:color w:val="15803D"/>
+                <w:sz w:val="20"/>
+                <w:szCs w:val="20"/>
+              </w:rPr>
+              <w:t xml:space="preserve">Fixed</w:t>
+            </w:r>
+          </w:p>
+        </w:tc>
+      </w:tr>
+      <w:tr>
+        <w:tc>
+          <w:tcPr>
+            <w:tcW w:type="dxa" w:w="2200"/>
+            <w:shd w:fill="F3F4F6" w:val="clear"/>
+            <w:tcMar>
+              <w:top w:type="dxa" w:w="100"/>
+              <w:left w:type="dxa" w:w="120"/>
+              <w:bottom w:type="dxa" w:w="100"/>
+              <w:right w:type="dxa" w:w="120"/>
+            </w:tcMar>
+          </w:tcPr>
+          <w:p>
+            <w:r>
+              <w:rPr>
+                <w:b w:val="false"/>
+                <w:bCs w:val="false"/>
+                <w:sz w:val="20"/>
+                <w:szCs w:val="20"/>
+              </w:rPr>
+              <w:t xml:space="preserve">Promised default-escalation penalties were never enforced</w:t>
+            </w:r>
+          </w:p>
+        </w:tc>
+        <w:tc>
+          <w:tcPr>
+            <w:tcW w:type="dxa" w:w="6900"/>
+            <w:shd w:fill="F3F4F6" w:val="clear"/>
+            <w:tcMar>
+              <w:top w:type="dxa" w:w="100"/>
+              <w:left w:type="dxa" w:w="120"/>
+              <w:bottom w:type="dxa" w:w="100"/>
+              <w:right w:type="dxa" w:w="120"/>
+            </w:tcMar>
+          </w:tcPr>
+          <w:p>
+            <w:r>
+              <w:rPr>
+                <w:b w:val="false"/>
+                <w:bCs w:val="false"/>
+                <w:sz w:val="20"/>
+                <w:szCs w:val="20"/>
+              </w:rPr>
+              <w:t xml:space="preserve">The loan agreement text tells borrowers "second default: 30-day suspension, third default: permanent ban," but nothing in code ever set those flags. Fixed end to end — a 2nd default now triggers a real 30-day borrowing suspension (which auto-lifts on schedule), a 3rd triggers a permanent ban.</w:t>
+            </w:r>
+          </w:p>
+        </w:tc>
+        <w:tc>
+          <w:tcPr>
+            <w:tcW w:type="dxa" w:w="1500"/>
+            <w:shd w:fill="F3F4F6" w:val="clear"/>
+            <w:tcMar>
+              <w:top w:type="dxa" w:w="100"/>
+              <w:left w:type="dxa" w:w="120"/>
+              <w:bottom w:type="dxa" w:w="100"/>
+              <w:right w:type="dxa" w:w="120"/>
+            </w:tcMar>
+          </w:tcPr>
+          <w:p>
+            <w:r>
+              <w:rPr>
+                <w:b/>
+                <w:bCs/>
+                <w:color w:val="15803D"/>
+                <w:sz w:val="20"/>
+                <w:szCs w:val="20"/>
+              </w:rPr>
+              <w:t xml:space="preserve">Fixed</w:t>
+            </w:r>
+          </w:p>
+        </w:tc>
+      </w:tr>
+      <w:tr>
+        <w:tc>
+          <w:tcPr>
+            <w:tcW w:type="dxa" w:w="2200"/>
+            <w:tcMar>
+              <w:top w:type="dxa" w:w="100"/>
+              <w:left w:type="dxa" w:w="120"/>
+              <w:bottom w:type="dxa" w:w="100"/>
+              <w:right w:type="dxa" w:w="120"/>
+            </w:tcMar>
+          </w:tcPr>
+          <w:p>
+            <w:r>
+              <w:rPr>
+                <w:b w:val="false"/>
+                <w:bCs w:val="false"/>
+                <w:sz w:val="20"/>
+                <w:szCs w:val="20"/>
+              </w:rPr>
+              <w:t xml:space="preserve">Group funding had no way to actually be used</w:t>
+            </w:r>
+          </w:p>
+        </w:tc>
+        <w:tc>
+          <w:tcPr>
+            <w:tcW w:type="dxa" w:w="6900"/>
+            <w:tcMar>
+              <w:top w:type="dxa" w:w="100"/>
+              <w:left w:type="dxa" w:w="120"/>
+              <w:bottom w:type="dxa" w:w="100"/>
+              <w:right w:type="dxa" w:w="120"/>
+            </w:tcMar>
+          </w:tcPr>
+          <w:p>
+            <w:r>
+              <w:rPr>
+                <w:b w:val="false"/>
+                <w:bCs w:val="false"/>
+                <w:sz w:val="20"/>
+                <w:szCs w:val="20"/>
+              </w:rPr>
+              <w:t xml:space="preserve">The backend fully supported multiple lenders contributing to one loan, but the frontend only ever called the single-lender "fund the whole thing" endpoint — there was no UI to contribute a partial amount. Built the missing UI: a contribution modal, a live funding-progress card visible to the circle, and a lender override to fund a flagged loan solo if they choose to accept the full risk.</w:t>
+            </w:r>
+          </w:p>
+        </w:tc>
+        <w:tc>
+          <w:tcPr>
+            <w:tcW w:type="dxa" w:w="1500"/>
+            <w:tcMar>
+              <w:top w:type="dxa" w:w="100"/>
+              <w:left w:type="dxa" w:w="120"/>
+              <w:bottom w:type="dxa" w:w="100"/>
+              <w:right w:type="dxa" w:w="120"/>
+            </w:tcMar>
+          </w:tcPr>
+          <w:p>
+            <w:r>
+              <w:rPr>
+                <w:b/>
+                <w:bCs/>
+                <w:color w:val="15803D"/>
+                <w:sz w:val="20"/>
+                <w:szCs w:val="20"/>
+              </w:rPr>
+              <w:t xml:space="preserve">Fixed</w:t>
+            </w:r>
+          </w:p>
+        </w:tc>
+      </w:tr>
+      <w:tr>
+        <w:tc>
+          <w:tcPr>
+            <w:tcW w:type="dxa" w:w="2200"/>
+            <w:shd w:fill="F3F4F6" w:val="clear"/>
+            <w:tcMar>
+              <w:top w:type="dxa" w:w="100"/>
+              <w:left w:type="dxa" w:w="120"/>
+              <w:bottom w:type="dxa" w:w="100"/>
+              <w:right w:type="dxa" w:w="120"/>
+            </w:tcMar>
+          </w:tcPr>
+          <w:p>
+            <w:r>
+              <w:rPr>
+                <w:b w:val="false"/>
+                <w:bCs w:val="false"/>
+                <w:sz w:val="20"/>
+                <w:szCs w:val="20"/>
+              </w:rPr>
+              <w:t xml:space="preserve">Group funding threshold was a flat number regardless of borrower risk</w:t>
+            </w:r>
+          </w:p>
+        </w:tc>
+        <w:tc>
+          <w:tcPr>
+            <w:tcW w:type="dxa" w:w="6900"/>
+            <w:shd w:fill="F3F4F6" w:val="clear"/>
+            <w:tcMar>
+              <w:top w:type="dxa" w:w="100"/>
+              <w:left w:type="dxa" w:w="120"/>
+              <w:bottom w:type="dxa" w:w="100"/>
+              <w:right w:type="dxa" w:w="120"/>
+            </w:tcMar>
+          </w:tcPr>
+          <w:p>
+            <w:r>
+              <w:rPr>
+                <w:b w:val="false"/>
+                <w:bCs w:val="false"/>
+                <w:sz w:val="20"/>
+                <w:szCs w:val="20"/>
+              </w:rPr>
+              <w:t xml:space="preserve">Any loan above a flat per-circle amount (GHS 3,000 default) required group funding, regardless of the borrower's trust score. Fixed so the threshold scales by the same trust tiers that cap interest rate — high-trust borrowers can go further above it before pooling is required, low-trust borrowers hit it sooner.</w:t>
+            </w:r>
+          </w:p>
+        </w:tc>
+        <w:tc>
+          <w:tcPr>
+            <w:tcW w:type="dxa" w:w="1500"/>
+            <w:shd w:fill="F3F4F6" w:val="clear"/>
+            <w:tcMar>
+              <w:top w:type="dxa" w:w="100"/>
+              <w:left w:type="dxa" w:w="120"/>
+              <w:bottom w:type="dxa" w:w="100"/>
+              <w:right w:type="dxa" w:w="120"/>
+            </w:tcMar>
+          </w:tcPr>
+          <w:p>
+            <w:r>
+              <w:rPr>
+                <w:b/>
+                <w:bCs/>
+                <w:color w:val="15803D"/>
+                <w:sz w:val="20"/>
+                <w:szCs w:val="20"/>
+              </w:rPr>
+              <w:t xml:space="preserve">Fixed</w:t>
+            </w:r>
+          </w:p>
+        </w:tc>
+      </w:tr>
+      <w:tr>
+        <w:tc>
+          <w:tcPr>
+            <w:tcW w:type="dxa" w:w="2200"/>
+            <w:tcMar>
+              <w:top w:type="dxa" w:w="100"/>
+              <w:left w:type="dxa" w:w="120"/>
+              <w:bottom w:type="dxa" w:w="100"/>
+              <w:right w:type="dxa" w:w="120"/>
+            </w:tcMar>
+          </w:tcPr>
+          <w:p>
+            <w:r>
+              <w:rPr>
+                <w:b w:val="false"/>
+                <w:bCs w:val="false"/>
+                <w:sz w:val="20"/>
+                <w:szCs w:val="20"/>
+              </w:rPr>
+              <w:t xml:space="preserve">Group-funded loans could never be marked defaulted</w:t>
+            </w:r>
+          </w:p>
+        </w:tc>
+        <w:tc>
+          <w:tcPr>
+            <w:tcW w:type="dxa" w:w="6900"/>
+            <w:tcMar>
+              <w:top w:type="dxa" w:w="100"/>
+              <w:left w:type="dxa" w:w="120"/>
+              <w:bottom w:type="dxa" w:w="100"/>
+              <w:right w:type="dxa" w:w="120"/>
+            </w:tcMar>
+          </w:tcPr>
+          <w:p>
+            <w:r>
+              <w:rPr>
+                <w:b w:val="false"/>
+                <w:bCs w:val="false"/>
+                <w:sz w:val="20"/>
+                <w:szCs w:val="20"/>
+              </w:rPr>
+              <w:t xml:space="preserve">The authorization check for marking a loan defaulted only recognized a single lenderId, which doesn't exist on a group-funded loan — so no one could ever trigger it, and the loan would sit accruing interest indefinitely. Fixed so any contributing lender can mark it defaulted once the grace period expires, same rule as the single-lender case.</w:t>
+            </w:r>
+          </w:p>
+        </w:tc>
+        <w:tc>
+          <w:tcPr>
+            <w:tcW w:type="dxa" w:w="1500"/>
+            <w:tcMar>
+              <w:top w:type="dxa" w:w="100"/>
+              <w:left w:type="dxa" w:w="120"/>
+              <w:bottom w:type="dxa" w:w="100"/>
+              <w:right w:type="dxa" w:w="120"/>
+            </w:tcMar>
+          </w:tcPr>
+          <w:p>
+            <w:r>
+              <w:rPr>
+                <w:b/>
+                <w:bCs/>
+                <w:color w:val="15803D"/>
+                <w:sz w:val="20"/>
+                <w:szCs w:val="20"/>
+              </w:rPr>
+              <w:t xml:space="preserve">Fixed</w:t>
+            </w:r>
+          </w:p>
+        </w:tc>
+      </w:tr>
+      <w:tr>
+        <w:tc>
+          <w:tcPr>
+            <w:tcW w:type="dxa" w:w="2200"/>
+            <w:shd w:fill="F3F4F6" w:val="clear"/>
+            <w:tcMar>
+              <w:top w:type="dxa" w:w="100"/>
+              <w:left w:type="dxa" w:w="120"/>
+              <w:bottom w:type="dxa" w:w="100"/>
+              <w:right w:type="dxa" w:w="120"/>
+            </w:tcMar>
+          </w:tcPr>
+          <w:p>
+            <w:r>
+              <w:rPr>
+                <w:b w:val="false"/>
+                <w:bCs w:val="false"/>
+                <w:sz w:val="20"/>
+                <w:szCs w:val="20"/>
+              </w:rPr>
+              <w:t xml:space="preserve">Onboarding screens reappeared on every login, not just after signup</w:t>
+            </w:r>
+          </w:p>
+        </w:tc>
+        <w:tc>
+          <w:tcPr>
+            <w:tcW w:type="dxa" w:w="6900"/>
+            <w:shd w:fill="F3F4F6" w:val="clear"/>
+            <w:tcMar>
+              <w:top w:type="dxa" w:w="100"/>
+              <w:left w:type="dxa" w:w="120"/>
+              <w:bottom w:type="dxa" w:w="100"/>
+              <w:right w:type="dxa" w:w="120"/>
+            </w:tcMar>
+          </w:tcPr>
+          <w:p>
+            <w:r>
+              <w:rPr>
+                <w:b w:val="false"/>
+                <w:bCs w:val="false"/>
+                <w:sz w:val="20"/>
+                <w:szCs w:val="20"/>
+              </w:rPr>
+              <w:t xml:space="preserve">The screen shown was chosen dynamically each render, but React Navigation only honors that on a navigator's first mount — so it silently fell back to always showing Onboarding first once the app had been used once. Fixed by making onboarding an explicit, one-time navigation action gated on a "just registered" flag, instead of something the router could land on by default.</w:t>
+            </w:r>
+          </w:p>
+        </w:tc>
+        <w:tc>
+          <w:tcPr>
+            <w:tcW w:type="dxa" w:w="1500"/>
+            <w:shd w:fill="F3F4F6" w:val="clear"/>
+            <w:tcMar>
+              <w:top w:type="dxa" w:w="100"/>
+              <w:left w:type="dxa" w:w="120"/>
+              <w:bottom w:type="dxa" w:w="100"/>
+              <w:right w:type="dxa" w:w="120"/>
+            </w:tcMar>
+          </w:tcPr>
+          <w:p>
+            <w:r>
+              <w:rPr>
+                <w:b/>
+                <w:bCs/>
+                <w:color w:val="15803D"/>
+                <w:sz w:val="20"/>
+                <w:szCs w:val="20"/>
+              </w:rPr>
+              <w:t xml:space="preserve">Fixed</w:t>
+            </w:r>
+          </w:p>
+        </w:tc>
+      </w:tr>
     </w:tbl>
     <w:p>
       <w:pPr>
@@ -1986,7 +2409,7 @@
                 <w:sz w:val="20"/>
                 <w:szCs w:val="20"/>
               </w:rPr>
-              <w:t xml:space="preserve">Endpoints like "mark a loan repaid," "set any user's trust score," and "inject an expense record" are reachable by anyone on the internet with a plain request — no login required. This is the single biggest real risk in the app. Not fixed tonight: the fix requires a shared-secret header across all 6 services plus matching environment variables set on all 6 live Railway/Render deployments and a coordinated redeploy — too much blast radius to do untested hours before the review. Top priority right after.</w:t>
+              <w:t xml:space="preserve">Endpoints like "mark a loan repaid," "set any user's trust score," and "inject an expense record" are reachable by anyone on the internet with a plain request — no login required. This is the single biggest real risk in the app. Not fixed: the fix requires a shared-secret header across all 6 services plus matching environment variables set on all 6 live Railway/Render deployments and a coordinated redeploy — too much blast radius to do untested hours before the review. Top priority right after.</w:t>
             </w:r>
           </w:p>
         </w:tc>
@@ -2128,147 +2551,6 @@
                 <w:szCs w:val="20"/>
               </w:rPr>
               <w:t xml:space="preserve">Paystack's webhook handler has no idempotency check tied to the transaction reference; a retried webhook (which Paystack sends automatically on timeout) could apply the same partial repayment twice. Full disbursement and full repayment happen to be protected by existing state guards — only partial repayment is exposed. Deferred because it touches live payment code.</w:t>
-            </w:r>
-          </w:p>
-        </w:tc>
-        <w:tc>
-          <w:tcPr>
-            <w:tcW w:type="dxa" w:w="1500"/>
-            <w:shd w:fill="F3F4F6" w:val="clear"/>
-            <w:tcMar>
-              <w:top w:type="dxa" w:w="100"/>
-              <w:left w:type="dxa" w:w="120"/>
-              <w:bottom w:type="dxa" w:w="100"/>
-              <w:right w:type="dxa" w:w="120"/>
-            </w:tcMar>
-          </w:tcPr>
-          <w:p>
-            <w:r>
-              <w:rPr>
-                <w:b/>
-                <w:bCs/>
-                <w:color w:val="B91C1C"/>
-                <w:sz w:val="20"/>
-                <w:szCs w:val="20"/>
-              </w:rPr>
-              <w:t xml:space="preserve">Open</w:t>
-            </w:r>
-          </w:p>
-        </w:tc>
-      </w:tr>
-      <w:tr>
-        <w:tc>
-          <w:tcPr>
-            <w:tcW w:type="dxa" w:w="2200"/>
-            <w:tcMar>
-              <w:top w:type="dxa" w:w="100"/>
-              <w:left w:type="dxa" w:w="120"/>
-              <w:bottom w:type="dxa" w:w="100"/>
-              <w:right w:type="dxa" w:w="120"/>
-            </w:tcMar>
-          </w:tcPr>
-          <w:p>
-            <w:r>
-              <w:rPr>
-                <w:b w:val="false"/>
-                <w:bCs w:val="false"/>
-                <w:sz w:val="20"/>
-                <w:szCs w:val="20"/>
-              </w:rPr>
-              <w:t xml:space="preserve">Overdue-loan scheduler bypasses the row lock other loan mutations use</w:t>
-            </w:r>
-          </w:p>
-        </w:tc>
-        <w:tc>
-          <w:tcPr>
-            <w:tcW w:type="dxa" w:w="6900"/>
-            <w:tcMar>
-              <w:top w:type="dxa" w:w="100"/>
-              <w:left w:type="dxa" w:w="120"/>
-              <w:bottom w:type="dxa" w:w="100"/>
-              <w:right w:type="dxa" w:w="120"/>
-            </w:tcMar>
-          </w:tcPr>
-          <w:p>
-            <w:r>
-              <w:rPr>
-                <w:b w:val="false"/>
-                <w:bCs w:val="false"/>
-                <w:sz w:val="20"/>
-                <w:szCs w:val="20"/>
-              </w:rPr>
-              <w:t xml:space="preserve">The hourly job that checks for overdue loans reads loans without the pessimistic lock used everywhere else, so a user action (repay/cancel/default) that lands mid-job could theoretically be silently overwritten. Narrow window, low likelihood during a short demo, but a real class of bug.</w:t>
-            </w:r>
-          </w:p>
-        </w:tc>
-        <w:tc>
-          <w:tcPr>
-            <w:tcW w:type="dxa" w:w="1500"/>
-            <w:tcMar>
-              <w:top w:type="dxa" w:w="100"/>
-              <w:left w:type="dxa" w:w="120"/>
-              <w:bottom w:type="dxa" w:w="100"/>
-              <w:right w:type="dxa" w:w="120"/>
-            </w:tcMar>
-          </w:tcPr>
-          <w:p>
-            <w:r>
-              <w:rPr>
-                <w:b/>
-                <w:bCs/>
-                <w:color w:val="B91C1C"/>
-                <w:sz w:val="20"/>
-                <w:szCs w:val="20"/>
-              </w:rPr>
-              <w:t xml:space="preserve">Open</w:t>
-            </w:r>
-          </w:p>
-        </w:tc>
-      </w:tr>
-      <w:tr>
-        <w:tc>
-          <w:tcPr>
-            <w:tcW w:type="dxa" w:w="2200"/>
-            <w:shd w:fill="F3F4F6" w:val="clear"/>
-            <w:tcMar>
-              <w:top w:type="dxa" w:w="100"/>
-              <w:left w:type="dxa" w:w="120"/>
-              <w:bottom w:type="dxa" w:w="100"/>
-              <w:right w:type="dxa" w:w="120"/>
-            </w:tcMar>
-          </w:tcPr>
-          <w:p>
-            <w:r>
-              <w:rPr>
-                <w:b w:val="false"/>
-                <w:bCs w:val="false"/>
-                <w:sz w:val="20"/>
-                <w:szCs w:val="20"/>
-              </w:rPr>
-              <w:t xml:space="preserve">Promised default-escalation penalties are never enforced</w:t>
-            </w:r>
-          </w:p>
-        </w:tc>
-        <w:tc>
-          <w:tcPr>
-            <w:tcW w:type="dxa" w:w="6900"/>
-            <w:shd w:fill="F3F4F6" w:val="clear"/>
-            <w:tcMar>
-              <w:top w:type="dxa" w:w="100"/>
-              <w:left w:type="dxa" w:w="120"/>
-              <w:bottom w:type="dxa" w:w="100"/>
-              <w:right w:type="dxa" w:w="120"/>
-            </w:tcMar>
-          </w:tcPr>
-          <w:p>
-            <w:r>
-              <w:rPr>
-                <w:b w:val="false"/>
-                <w:bCs w:val="false"/>
-                <w:sz w:val="20"/>
-                <w:szCs w:val="20"/>
-              </w:rPr>
-              <w:t xml:space="preserve">The loan agreement text tells borrowers "second default: 30-day suspension, third default: permanent ban," but nothing in code ever sets those flags — a user can default repeatedly with only a trust-score dip. Contradicts the signed agreement text.</w:t>
             </w:r>
           </w:p>
         </w:tc>

</xml_diff>